<commit_message>
Added trees, finished, final upload and tweaks
</commit_message>
<xml_diff>
--- a/design.docx
+++ b/design.docx
@@ -40,30 +40,96 @@
           <w:szCs w:val="24"/>
         </w:rPr>
       </w:pPr>
-    </w:p>
-    <w:p>
-      <w:pPr>
-        <w:rPr>
-          <w:sz w:val="24"/>
-          <w:szCs w:val="24"/>
-        </w:rPr>
-      </w:pPr>
-    </w:p>
-    <w:p>
-      <w:pPr>
-        <w:rPr>
-          <w:sz w:val="24"/>
-          <w:szCs w:val="24"/>
-        </w:rPr>
-      </w:pPr>
-    </w:p>
-    <w:p>
-      <w:pPr>
-        <w:rPr>
-          <w:sz w:val="24"/>
-          <w:szCs w:val="24"/>
-        </w:rPr>
-      </w:pPr>
+      <w:r>
+        <w:rPr>
+          <w:sz w:val="24"/>
+          <w:szCs w:val="24"/>
+        </w:rPr>
+        <w:t>1 – Theme, Overview, Project Plan, External Asset list and Polycom Scanned items</w:t>
+      </w:r>
+    </w:p>
+    <w:p>
+      <w:pPr>
+        <w:rPr>
+          <w:sz w:val="24"/>
+          <w:szCs w:val="24"/>
+        </w:rPr>
+      </w:pPr>
+      <w:r>
+        <w:rPr>
+          <w:sz w:val="24"/>
+          <w:szCs w:val="24"/>
+        </w:rPr>
+        <w:t>2</w:t>
+      </w:r>
+      <w:r>
+        <w:rPr>
+          <w:sz w:val="24"/>
+          <w:szCs w:val="24"/>
+        </w:rPr>
+        <w:t xml:space="preserve"> </w:t>
+      </w:r>
+      <w:proofErr w:type="gramStart"/>
+      <w:r>
+        <w:rPr>
+          <w:sz w:val="24"/>
+          <w:szCs w:val="24"/>
+        </w:rPr>
+        <w:t xml:space="preserve">-  </w:t>
+      </w:r>
+      <w:proofErr w:type="spellStart"/>
+      <w:r>
+        <w:rPr>
+          <w:sz w:val="24"/>
+          <w:szCs w:val="24"/>
+        </w:rPr>
+        <w:t>Polycam</w:t>
+      </w:r>
+      <w:proofErr w:type="spellEnd"/>
+      <w:proofErr w:type="gramEnd"/>
+      <w:r>
+        <w:rPr>
+          <w:sz w:val="24"/>
+          <w:szCs w:val="24"/>
+        </w:rPr>
+        <w:t xml:space="preserve"> scanned items continued, Mood Board and Mad Design Wireframe</w:t>
+      </w:r>
+    </w:p>
+    <w:p>
+      <w:pPr>
+        <w:rPr>
+          <w:sz w:val="24"/>
+          <w:szCs w:val="24"/>
+        </w:rPr>
+      </w:pPr>
+      <w:r>
+        <w:rPr>
+          <w:sz w:val="24"/>
+          <w:szCs w:val="24"/>
+        </w:rPr>
+        <w:t>3</w:t>
+      </w:r>
+      <w:r>
+        <w:rPr>
+          <w:sz w:val="24"/>
+          <w:szCs w:val="24"/>
+        </w:rPr>
+        <w:t xml:space="preserve"> –</w:t>
+      </w:r>
+      <w:r>
+        <w:rPr>
+          <w:sz w:val="24"/>
+          <w:szCs w:val="24"/>
+        </w:rPr>
+        <w:t xml:space="preserve"> </w:t>
+      </w:r>
+      <w:r>
+        <w:rPr>
+          <w:sz w:val="24"/>
+          <w:szCs w:val="24"/>
+        </w:rPr>
+        <w:t>Final map design and images</w:t>
+      </w:r>
     </w:p>
     <w:p>
       <w:pPr>
@@ -263,7 +329,7 @@
           <w:szCs w:val="48"/>
         </w:rPr>
         <w:lastRenderedPageBreak/>
-        <w:t>Project Plan</w:t>
+        <w:t>Theme</w:t>
       </w:r>
     </w:p>
     <w:p>
@@ -299,14 +365,35 @@
           <w:sz w:val="24"/>
           <w:szCs w:val="24"/>
         </w:rPr>
-        <w:t>My game is going to be about the theme of responsible consumption and encouraging the player to not litter</w:t>
-      </w:r>
-      <w:r>
-        <w:rPr>
-          <w:sz w:val="24"/>
-          <w:szCs w:val="24"/>
-        </w:rPr>
-        <w:t xml:space="preserve"> (Reduce waste generation through preventions, </w:t>
+        <w:t xml:space="preserve">My game is going to be about the theme of </w:t>
+      </w:r>
+      <w:r>
+        <w:rPr>
+          <w:sz w:val="24"/>
+          <w:szCs w:val="24"/>
+        </w:rPr>
+        <w:t xml:space="preserve">Life on land </w:t>
+      </w:r>
+      <w:r>
+        <w:rPr>
+          <w:sz w:val="24"/>
+          <w:szCs w:val="24"/>
+        </w:rPr>
+        <w:t xml:space="preserve">and encouraging the player </w:t>
+      </w:r>
+      <w:r>
+        <w:rPr>
+          <w:sz w:val="24"/>
+          <w:szCs w:val="24"/>
+        </w:rPr>
+        <w:t xml:space="preserve">to help with ongoing clean-up effort in the local area </w:t>
+      </w:r>
+      <w:r>
+        <w:rPr>
+          <w:sz w:val="24"/>
+          <w:szCs w:val="24"/>
+        </w:rPr>
+        <w:t xml:space="preserve">(Reduce waste generation through preventions, </w:t>
       </w:r>
       <w:r>
         <w:rPr>
@@ -343,7 +430,21 @@
           <w:sz w:val="24"/>
           <w:szCs w:val="24"/>
         </w:rPr>
-        <w:t xml:space="preserve">his also falls under another of the UN SDG goals however, as Life Below Water (SDG 14) is greatly affected by littering on land as well, so this will be a game covering all of this through encouraging cleanup of local communities via a </w:t>
+        <w:t>his also falls under another of the UN SDG goals however, as Life Below Water (SDG 1</w:t>
+      </w:r>
+      <w:r>
+        <w:rPr>
+          <w:sz w:val="24"/>
+          <w:szCs w:val="24"/>
+        </w:rPr>
+        <w:t>4</w:t>
+      </w:r>
+      <w:r>
+        <w:rPr>
+          <w:sz w:val="24"/>
+          <w:szCs w:val="24"/>
+        </w:rPr>
+        <w:t xml:space="preserve">) is greatly affected by littering on land as well, so this will be a game covering all of this through encouraging cleanup of local communities via a </w:t>
       </w:r>
       <w:r>
         <w:rPr>
@@ -365,6 +466,13 @@
           <w:szCs w:val="24"/>
         </w:rPr>
         <w:t>skip by a country home in the middle, demonstrating a landmark that must be preserved</w:t>
+      </w:r>
+      <w:r>
+        <w:rPr>
+          <w:sz w:val="24"/>
+          <w:szCs w:val="24"/>
+        </w:rPr>
+        <w:t>.</w:t>
       </w:r>
     </w:p>
     <w:p>
@@ -535,15 +643,13 @@
         </w:rPr>
         <w:t xml:space="preserve">, finish main elements and functions, focus on </w:t>
       </w:r>
-      <w:proofErr w:type="spellStart"/>
-      <w:r>
-        <w:rPr>
-          <w:sz w:val="24"/>
-          <w:szCs w:val="24"/>
-        </w:rPr>
-        <w:t>vfx</w:t>
-      </w:r>
-      <w:proofErr w:type="spellEnd"/>
+      <w:r>
+        <w:rPr>
+          <w:sz w:val="24"/>
+          <w:szCs w:val="24"/>
+        </w:rPr>
+        <w:t>VFX</w:t>
+      </w:r>
       <w:r>
         <w:rPr>
           <w:sz w:val="24"/>
@@ -551,15 +657,13 @@
         </w:rPr>
         <w:t xml:space="preserve"> and </w:t>
       </w:r>
-      <w:proofErr w:type="spellStart"/>
-      <w:r>
-        <w:rPr>
-          <w:sz w:val="24"/>
-          <w:szCs w:val="24"/>
-        </w:rPr>
-        <w:t>sfx</w:t>
-      </w:r>
-      <w:proofErr w:type="spellEnd"/>
+      <w:r>
+        <w:rPr>
+          <w:sz w:val="24"/>
+          <w:szCs w:val="24"/>
+        </w:rPr>
+        <w:t>SFX</w:t>
+      </w:r>
     </w:p>
     <w:p>
       <w:pPr>
@@ -631,6 +735,16 @@
           <w:szCs w:val="28"/>
           <w:u w:val="single"/>
         </w:rPr>
+        <w:t xml:space="preserve"> or CC0</w:t>
+      </w:r>
+      <w:r>
+        <w:rPr>
+          <w:b/>
+          <w:bCs/>
+          <w:sz w:val="28"/>
+          <w:szCs w:val="28"/>
+          <w:u w:val="single"/>
+        </w:rPr>
         <w:t>)</w:t>
       </w:r>
     </w:p>
@@ -678,7 +792,7 @@
         </w:rPr>
         <w:t xml:space="preserve"> - </w:t>
       </w:r>
-      <w:hyperlink r:id="rId4" w:history="1">
+      <w:hyperlink r:id="rId5" w:history="1">
         <w:r>
           <w:rPr>
             <w:rStyle w:val="Hyperlink"/>
@@ -710,7 +824,7 @@
         </w:rPr>
         <w:t xml:space="preserve">Low Poly Dumpster - </w:t>
       </w:r>
-      <w:hyperlink r:id="rId5" w:history="1">
+      <w:hyperlink r:id="rId6" w:history="1">
         <w:r>
           <w:rPr>
             <w:rStyle w:val="Hyperlink"/>
@@ -731,6 +845,56 @@
     <w:p>
       <w:pPr>
         <w:rPr>
+          <w:sz w:val="24"/>
+          <w:szCs w:val="24"/>
+        </w:rPr>
+      </w:pPr>
+      <w:r>
+        <w:rPr>
+          <w:sz w:val="24"/>
+          <w:szCs w:val="24"/>
+        </w:rPr>
+        <w:t xml:space="preserve">Satara Night (Skybox) - </w:t>
+      </w:r>
+      <w:hyperlink r:id="rId7" w:history="1">
+        <w:r>
+          <w:rPr>
+            <w:rStyle w:val="Hyperlink"/>
+            <w:sz w:val="24"/>
+            <w:szCs w:val="24"/>
+          </w:rPr>
+          <w:t>https://polyhaven.com/a/satara_night</w:t>
+        </w:r>
+      </w:hyperlink>
+    </w:p>
+    <w:p>
+      <w:pPr>
+        <w:rPr>
+          <w:sz w:val="24"/>
+          <w:szCs w:val="24"/>
+        </w:rPr>
+      </w:pPr>
+      <w:r>
+        <w:rPr>
+          <w:sz w:val="24"/>
+          <w:szCs w:val="24"/>
+        </w:rPr>
+        <w:t xml:space="preserve">Gentree Generic Tree - </w:t>
+      </w:r>
+      <w:hyperlink r:id="rId8" w:history="1">
+        <w:r>
+          <w:rPr>
+            <w:rStyle w:val="Hyperlink"/>
+            <w:sz w:val="24"/>
+            <w:szCs w:val="24"/>
+          </w:rPr>
+          <w:t>https://www.turbosquid.com/FullPreview/2062795</w:t>
+        </w:r>
+      </w:hyperlink>
+    </w:p>
+    <w:p>
+      <w:pPr>
+        <w:rPr>
           <w:b/>
           <w:bCs/>
           <w:sz w:val="28"/>
@@ -758,6 +922,28 @@
         </w:rPr>
         <w:t xml:space="preserve"> Items</w:t>
       </w:r>
+      <w:r>
+        <w:rPr>
+          <w:b/>
+          <w:bCs/>
+          <w:sz w:val="28"/>
+          <w:szCs w:val="28"/>
+          <w:u w:val="single"/>
+        </w:rPr>
+        <w:t xml:space="preserve"> via </w:t>
+      </w:r>
+      <w:proofErr w:type="spellStart"/>
+      <w:r>
+        <w:rPr>
+          <w:b/>
+          <w:bCs/>
+          <w:sz w:val="28"/>
+          <w:szCs w:val="28"/>
+          <w:u w:val="single"/>
+        </w:rPr>
+        <w:t>PolyCam</w:t>
+      </w:r>
+      <w:proofErr w:type="spellEnd"/>
     </w:p>
     <w:p>
       <w:pPr>
@@ -781,6 +967,1372 @@
           <w:szCs w:val="24"/>
         </w:rPr>
       </w:pPr>
+      <w:r>
+        <w:rPr>
+          <w:sz w:val="24"/>
+          <w:szCs w:val="24"/>
+        </w:rPr>
+        <w:t>Models:</w:t>
+      </w:r>
+    </w:p>
+    <w:p>
+      <w:pPr>
+        <w:pStyle w:val="ListParagraph"/>
+        <w:numPr>
+          <w:ilvl w:val="0"/>
+          <w:numId w:val="1"/>
+        </w:numPr>
+        <w:rPr>
+          <w:sz w:val="24"/>
+          <w:szCs w:val="24"/>
+        </w:rPr>
+      </w:pPr>
+      <w:r>
+        <w:rPr>
+          <w:sz w:val="24"/>
+          <w:szCs w:val="24"/>
+        </w:rPr>
+        <w:t>Coca Cola Cherry Float Can</w:t>
+      </w:r>
+    </w:p>
+    <w:p>
+      <w:pPr>
+        <w:pStyle w:val="ListParagraph"/>
+        <w:numPr>
+          <w:ilvl w:val="0"/>
+          <w:numId w:val="1"/>
+        </w:numPr>
+        <w:rPr>
+          <w:sz w:val="24"/>
+          <w:szCs w:val="24"/>
+        </w:rPr>
+      </w:pPr>
+      <w:r>
+        <w:rPr>
+          <w:sz w:val="24"/>
+          <w:szCs w:val="24"/>
+        </w:rPr>
+        <w:t xml:space="preserve">Tesco Sandwich </w:t>
+      </w:r>
+    </w:p>
+    <w:p>
+      <w:pPr>
+        <w:pStyle w:val="ListParagraph"/>
+        <w:numPr>
+          <w:ilvl w:val="0"/>
+          <w:numId w:val="1"/>
+        </w:numPr>
+        <w:rPr>
+          <w:sz w:val="24"/>
+          <w:szCs w:val="24"/>
+        </w:rPr>
+      </w:pPr>
+      <w:r>
+        <w:rPr>
+          <w:sz w:val="24"/>
+          <w:szCs w:val="24"/>
+        </w:rPr>
+        <w:t>Jimmys Coffee</w:t>
+      </w:r>
+    </w:p>
+    <w:p>
+      <w:pPr>
+        <w:pStyle w:val="ListParagraph"/>
+        <w:numPr>
+          <w:ilvl w:val="0"/>
+          <w:numId w:val="1"/>
+        </w:numPr>
+        <w:rPr>
+          <w:sz w:val="24"/>
+          <w:szCs w:val="24"/>
+        </w:rPr>
+      </w:pPr>
+      <w:r>
+        <w:rPr>
+          <w:sz w:val="24"/>
+          <w:szCs w:val="24"/>
+        </w:rPr>
+        <w:t>Half-Eaten Sandwich</w:t>
+      </w:r>
+    </w:p>
+    <w:p>
+      <w:pPr>
+        <w:pStyle w:val="ListParagraph"/>
+        <w:numPr>
+          <w:ilvl w:val="0"/>
+          <w:numId w:val="1"/>
+        </w:numPr>
+        <w:rPr>
+          <w:sz w:val="24"/>
+          <w:szCs w:val="24"/>
+        </w:rPr>
+      </w:pPr>
+      <w:r>
+        <w:rPr>
+          <w:sz w:val="24"/>
+          <w:szCs w:val="24"/>
+        </w:rPr>
+        <w:lastRenderedPageBreak/>
+        <w:t>Costa Cup</w:t>
+      </w:r>
+      <w:r>
+        <w:rPr>
+          <w:sz w:val="24"/>
+          <w:szCs w:val="24"/>
+        </w:rPr>
+        <w:t xml:space="preserve"> </w:t>
+      </w:r>
+    </w:p>
+    <w:p>
+      <w:pPr>
+        <w:pStyle w:val="ListParagraph"/>
+        <w:rPr>
+          <w:sz w:val="24"/>
+          <w:szCs w:val="24"/>
+        </w:rPr>
+      </w:pPr>
+    </w:p>
+    <w:p>
+      <w:pPr>
+        <w:rPr>
+          <w:b/>
+          <w:bCs/>
+          <w:sz w:val="28"/>
+          <w:szCs w:val="28"/>
+          <w:u w:val="single"/>
+        </w:rPr>
+      </w:pPr>
+      <w:r>
+        <w:rPr>
+          <w:b/>
+          <w:bCs/>
+          <w:sz w:val="28"/>
+          <w:szCs w:val="28"/>
+          <w:u w:val="single"/>
+        </w:rPr>
+        <w:t>Mood Board:</w:t>
+      </w:r>
+    </w:p>
+    <w:p>
+      <w:pPr>
+        <w:rPr>
+          <w:sz w:val="24"/>
+          <w:szCs w:val="24"/>
+        </w:rPr>
+      </w:pPr>
+      <w:r>
+        <w:rPr>
+          <w:sz w:val="24"/>
+          <w:szCs w:val="24"/>
+        </w:rPr>
+        <w:drawing>
+          <wp:inline distT="0" distB="0" distL="0" distR="0" wp14:anchorId="630DA172" wp14:editId="1CF787AE">
+            <wp:extent cx="5731510" cy="2418080"/>
+            <wp:effectExtent l="0" t="0" r="2540" b="1270"/>
+            <wp:docPr id="1912753722" name="Picture 1"/>
+            <wp:cNvGraphicFramePr>
+              <a:graphicFrameLocks xmlns:a="http://schemas.openxmlformats.org/drawingml/2006/main" noChangeAspect="1"/>
+            </wp:cNvGraphicFramePr>
+            <a:graphic xmlns:a="http://schemas.openxmlformats.org/drawingml/2006/main">
+              <a:graphicData uri="http://schemas.openxmlformats.org/drawingml/2006/picture">
+                <pic:pic xmlns:pic="http://schemas.openxmlformats.org/drawingml/2006/picture">
+                  <pic:nvPicPr>
+                    <pic:cNvPr id="1912753722" name=""/>
+                    <pic:cNvPicPr/>
+                  </pic:nvPicPr>
+                  <pic:blipFill>
+                    <a:blip r:embed="rId9"/>
+                    <a:stretch>
+                      <a:fillRect/>
+                    </a:stretch>
+                  </pic:blipFill>
+                  <pic:spPr>
+                    <a:xfrm>
+                      <a:off x="0" y="0"/>
+                      <a:ext cx="5731510" cy="2418080"/>
+                    </a:xfrm>
+                    <a:prstGeom prst="rect">
+                      <a:avLst/>
+                    </a:prstGeom>
+                  </pic:spPr>
+                </pic:pic>
+              </a:graphicData>
+            </a:graphic>
+          </wp:inline>
+        </w:drawing>
+      </w:r>
+    </w:p>
+    <w:p>
+      <w:pPr>
+        <w:pStyle w:val="ListParagraph"/>
+        <w:rPr>
+          <w:sz w:val="24"/>
+          <w:szCs w:val="24"/>
+        </w:rPr>
+      </w:pPr>
+    </w:p>
+    <w:p>
+      <w:pPr>
+        <w:rPr>
+          <w:b/>
+          <w:bCs/>
+          <w:sz w:val="28"/>
+          <w:szCs w:val="28"/>
+          <w:u w:val="single"/>
+        </w:rPr>
+      </w:pPr>
+      <w:r>
+        <w:rPr>
+          <w:b/>
+          <w:bCs/>
+          <w:sz w:val="28"/>
+          <w:szCs w:val="28"/>
+          <w:u w:val="single"/>
+        </w:rPr>
+        <w:t>Map Design:</w:t>
+      </w:r>
+    </w:p>
+    <w:p>
+      <w:pPr>
+        <w:rPr>
+          <w:sz w:val="24"/>
+          <w:szCs w:val="24"/>
+        </w:rPr>
+      </w:pPr>
+      <w:r>
+        <w:rPr>
+          <w:sz w:val="24"/>
+          <w:szCs w:val="24"/>
+        </w:rPr>
+        <w:drawing>
+          <wp:inline distT="0" distB="0" distL="0" distR="0" wp14:anchorId="3A94D313" wp14:editId="16A763BF">
+            <wp:extent cx="5731510" cy="3194050"/>
+            <wp:effectExtent l="0" t="0" r="2540" b="6350"/>
+            <wp:docPr id="1714048075" name="Picture 1"/>
+            <wp:cNvGraphicFramePr>
+              <a:graphicFrameLocks xmlns:a="http://schemas.openxmlformats.org/drawingml/2006/main" noChangeAspect="1"/>
+            </wp:cNvGraphicFramePr>
+            <a:graphic xmlns:a="http://schemas.openxmlformats.org/drawingml/2006/main">
+              <a:graphicData uri="http://schemas.openxmlformats.org/drawingml/2006/picture">
+                <pic:pic xmlns:pic="http://schemas.openxmlformats.org/drawingml/2006/picture">
+                  <pic:nvPicPr>
+                    <pic:cNvPr id="1714048075" name=""/>
+                    <pic:cNvPicPr/>
+                  </pic:nvPicPr>
+                  <pic:blipFill>
+                    <a:blip r:embed="rId10"/>
+                    <a:stretch>
+                      <a:fillRect/>
+                    </a:stretch>
+                  </pic:blipFill>
+                  <pic:spPr>
+                    <a:xfrm>
+                      <a:off x="0" y="0"/>
+                      <a:ext cx="5731510" cy="3194050"/>
+                    </a:xfrm>
+                    <a:prstGeom prst="rect">
+                      <a:avLst/>
+                    </a:prstGeom>
+                  </pic:spPr>
+                </pic:pic>
+              </a:graphicData>
+            </a:graphic>
+          </wp:inline>
+        </w:drawing>
+      </w:r>
+    </w:p>
+    <w:p>
+      <w:pPr>
+        <w:rPr>
+          <w:sz w:val="24"/>
+          <w:szCs w:val="24"/>
+        </w:rPr>
+      </w:pPr>
+      <w:r>
+        <w:rPr>
+          <w:sz w:val="24"/>
+          <w:szCs w:val="24"/>
+        </w:rPr>
+        <w:t>IN UNITY:</w:t>
+      </w:r>
+    </w:p>
+    <w:p>
+      <w:pPr>
+        <w:rPr>
+          <w:sz w:val="24"/>
+          <w:szCs w:val="24"/>
+        </w:rPr>
+      </w:pPr>
+      <w:r>
+        <w:rPr>
+          <w:sz w:val="24"/>
+          <w:szCs w:val="24"/>
+        </w:rPr>
+        <w:lastRenderedPageBreak/>
+        <w:drawing>
+          <wp:inline distT="0" distB="0" distL="0" distR="0" wp14:anchorId="17BB64E8" wp14:editId="588586BD">
+            <wp:extent cx="5731510" cy="2879725"/>
+            <wp:effectExtent l="0" t="0" r="2540" b="0"/>
+            <wp:docPr id="1735719085" name="Picture 1"/>
+            <wp:cNvGraphicFramePr>
+              <a:graphicFrameLocks xmlns:a="http://schemas.openxmlformats.org/drawingml/2006/main" noChangeAspect="1"/>
+            </wp:cNvGraphicFramePr>
+            <a:graphic xmlns:a="http://schemas.openxmlformats.org/drawingml/2006/main">
+              <a:graphicData uri="http://schemas.openxmlformats.org/drawingml/2006/picture">
+                <pic:pic xmlns:pic="http://schemas.openxmlformats.org/drawingml/2006/picture">
+                  <pic:nvPicPr>
+                    <pic:cNvPr id="1735719085" name=""/>
+                    <pic:cNvPicPr/>
+                  </pic:nvPicPr>
+                  <pic:blipFill>
+                    <a:blip r:embed="rId11"/>
+                    <a:stretch>
+                      <a:fillRect/>
+                    </a:stretch>
+                  </pic:blipFill>
+                  <pic:spPr>
+                    <a:xfrm>
+                      <a:off x="0" y="0"/>
+                      <a:ext cx="5731510" cy="2879725"/>
+                    </a:xfrm>
+                    <a:prstGeom prst="rect">
+                      <a:avLst/>
+                    </a:prstGeom>
+                  </pic:spPr>
+                </pic:pic>
+              </a:graphicData>
+            </a:graphic>
+          </wp:inline>
+        </w:drawing>
+      </w:r>
+    </w:p>
+    <w:p>
+      <w:pPr>
+        <w:rPr>
+          <w:b/>
+          <w:bCs/>
+          <w:sz w:val="28"/>
+          <w:szCs w:val="28"/>
+          <w:u w:val="single"/>
+        </w:rPr>
+      </w:pPr>
+      <w:r>
+        <w:rPr>
+          <w:b/>
+          <w:bCs/>
+          <w:sz w:val="28"/>
+          <w:szCs w:val="28"/>
+          <w:u w:val="single"/>
+        </w:rPr>
+        <w:t>Photogrammetry</w:t>
+      </w:r>
+    </w:p>
+    <w:p>
+      <w:pPr>
+        <w:rPr>
+          <w:sz w:val="24"/>
+          <w:szCs w:val="24"/>
+          <w:u w:val="single"/>
+        </w:rPr>
+      </w:pPr>
+    </w:p>
+    <w:p>
+      <w:pPr>
+        <w:rPr>
+          <w:sz w:val="24"/>
+          <w:szCs w:val="24"/>
+        </w:rPr>
+      </w:pPr>
+      <w:r>
+        <w:rPr>
+          <w:noProof/>
+          <w:sz w:val="24"/>
+          <w:szCs w:val="24"/>
+        </w:rPr>
+        <w:drawing>
+          <wp:anchor distT="0" distB="0" distL="114300" distR="114300" simplePos="0" relativeHeight="251661312" behindDoc="0" locked="0" layoutInCell="1" allowOverlap="1" wp14:anchorId="5110646F" wp14:editId="664E4C84">
+            <wp:simplePos x="0" y="0"/>
+            <wp:positionH relativeFrom="margin">
+              <wp:posOffset>4382219</wp:posOffset>
+            </wp:positionH>
+            <wp:positionV relativeFrom="paragraph">
+              <wp:posOffset>256408</wp:posOffset>
+            </wp:positionV>
+            <wp:extent cx="1406106" cy="1874755"/>
+            <wp:effectExtent l="0" t="0" r="3810" b="0"/>
+            <wp:wrapNone/>
+            <wp:docPr id="1071192228" name="Picture 9"/>
+            <wp:cNvGraphicFramePr>
+              <a:graphicFrameLocks xmlns:a="http://schemas.openxmlformats.org/drawingml/2006/main" noChangeAspect="1"/>
+            </wp:cNvGraphicFramePr>
+            <a:graphic xmlns:a="http://schemas.openxmlformats.org/drawingml/2006/main">
+              <a:graphicData uri="http://schemas.openxmlformats.org/drawingml/2006/picture">
+                <pic:pic xmlns:pic="http://schemas.openxmlformats.org/drawingml/2006/picture">
+                  <pic:nvPicPr>
+                    <pic:cNvPr id="0" name="Picture 6"/>
+                    <pic:cNvPicPr>
+                      <a:picLocks noChangeAspect="1" noChangeArrowheads="1"/>
+                    </pic:cNvPicPr>
+                  </pic:nvPicPr>
+                  <pic:blipFill>
+                    <a:blip r:embed="rId12" cstate="print">
+                      <a:extLst>
+                        <a:ext uri="{28A0092B-C50C-407E-A947-70E740481C1C}">
+                          <a14:useLocalDpi xmlns:a14="http://schemas.microsoft.com/office/drawing/2010/main" val="0"/>
+                        </a:ext>
+                      </a:extLst>
+                    </a:blip>
+                    <a:srcRect/>
+                    <a:stretch>
+                      <a:fillRect/>
+                    </a:stretch>
+                  </pic:blipFill>
+                  <pic:spPr bwMode="auto">
+                    <a:xfrm>
+                      <a:off x="0" y="0"/>
+                      <a:ext cx="1409492" cy="1879269"/>
+                    </a:xfrm>
+                    <a:prstGeom prst="rect">
+                      <a:avLst/>
+                    </a:prstGeom>
+                    <a:noFill/>
+                    <a:ln>
+                      <a:noFill/>
+                    </a:ln>
+                  </pic:spPr>
+                </pic:pic>
+              </a:graphicData>
+            </a:graphic>
+            <wp14:sizeRelH relativeFrom="margin">
+              <wp14:pctWidth>0</wp14:pctWidth>
+            </wp14:sizeRelH>
+            <wp14:sizeRelV relativeFrom="margin">
+              <wp14:pctHeight>0</wp14:pctHeight>
+            </wp14:sizeRelV>
+          </wp:anchor>
+        </w:drawing>
+      </w:r>
+      <w:r>
+        <w:rPr>
+          <w:noProof/>
+          <w:sz w:val="24"/>
+          <w:szCs w:val="24"/>
+        </w:rPr>
+        <w:drawing>
+          <wp:anchor distT="0" distB="0" distL="114300" distR="114300" simplePos="0" relativeHeight="251662336" behindDoc="0" locked="0" layoutInCell="1" allowOverlap="1" wp14:anchorId="014DD744" wp14:editId="449A1617">
+            <wp:simplePos x="0" y="0"/>
+            <wp:positionH relativeFrom="column">
+              <wp:posOffset>2923852</wp:posOffset>
+            </wp:positionH>
+            <wp:positionV relativeFrom="paragraph">
+              <wp:posOffset>267970</wp:posOffset>
+            </wp:positionV>
+            <wp:extent cx="1401541" cy="1868721"/>
+            <wp:effectExtent l="0" t="0" r="8255" b="0"/>
+            <wp:wrapNone/>
+            <wp:docPr id="2128051987" name="Picture 10"/>
+            <wp:cNvGraphicFramePr>
+              <a:graphicFrameLocks xmlns:a="http://schemas.openxmlformats.org/drawingml/2006/main" noChangeAspect="1"/>
+            </wp:cNvGraphicFramePr>
+            <a:graphic xmlns:a="http://schemas.openxmlformats.org/drawingml/2006/main">
+              <a:graphicData uri="http://schemas.openxmlformats.org/drawingml/2006/picture">
+                <pic:pic xmlns:pic="http://schemas.openxmlformats.org/drawingml/2006/picture">
+                  <pic:nvPicPr>
+                    <pic:cNvPr id="0" name="Picture 7"/>
+                    <pic:cNvPicPr>
+                      <a:picLocks noChangeAspect="1" noChangeArrowheads="1"/>
+                    </pic:cNvPicPr>
+                  </pic:nvPicPr>
+                  <pic:blipFill>
+                    <a:blip r:embed="rId13" cstate="print">
+                      <a:extLst>
+                        <a:ext uri="{28A0092B-C50C-407E-A947-70E740481C1C}">
+                          <a14:useLocalDpi xmlns:a14="http://schemas.microsoft.com/office/drawing/2010/main" val="0"/>
+                        </a:ext>
+                      </a:extLst>
+                    </a:blip>
+                    <a:srcRect/>
+                    <a:stretch>
+                      <a:fillRect/>
+                    </a:stretch>
+                  </pic:blipFill>
+                  <pic:spPr bwMode="auto">
+                    <a:xfrm>
+                      <a:off x="0" y="0"/>
+                      <a:ext cx="1401541" cy="1868721"/>
+                    </a:xfrm>
+                    <a:prstGeom prst="rect">
+                      <a:avLst/>
+                    </a:prstGeom>
+                    <a:noFill/>
+                    <a:ln>
+                      <a:noFill/>
+                    </a:ln>
+                  </pic:spPr>
+                </pic:pic>
+              </a:graphicData>
+            </a:graphic>
+            <wp14:sizeRelH relativeFrom="margin">
+              <wp14:pctWidth>0</wp14:pctWidth>
+            </wp14:sizeRelH>
+            <wp14:sizeRelV relativeFrom="margin">
+              <wp14:pctHeight>0</wp14:pctHeight>
+            </wp14:sizeRelV>
+          </wp:anchor>
+        </w:drawing>
+      </w:r>
+      <w:r>
+        <w:rPr>
+          <w:noProof/>
+          <w:sz w:val="24"/>
+          <w:szCs w:val="24"/>
+        </w:rPr>
+        <w:drawing>
+          <wp:anchor distT="0" distB="0" distL="114300" distR="114300" simplePos="0" relativeHeight="251663360" behindDoc="0" locked="0" layoutInCell="1" allowOverlap="1" wp14:anchorId="0BB5F71B" wp14:editId="205DABF2">
+            <wp:simplePos x="0" y="0"/>
+            <wp:positionH relativeFrom="margin">
+              <wp:posOffset>1457865</wp:posOffset>
+            </wp:positionH>
+            <wp:positionV relativeFrom="paragraph">
+              <wp:posOffset>273661</wp:posOffset>
+            </wp:positionV>
+            <wp:extent cx="1409976" cy="1879917"/>
+            <wp:effectExtent l="0" t="0" r="0" b="6350"/>
+            <wp:wrapNone/>
+            <wp:docPr id="880955427" name="Picture 11"/>
+            <wp:cNvGraphicFramePr>
+              <a:graphicFrameLocks xmlns:a="http://schemas.openxmlformats.org/drawingml/2006/main" noChangeAspect="1"/>
+            </wp:cNvGraphicFramePr>
+            <a:graphic xmlns:a="http://schemas.openxmlformats.org/drawingml/2006/main">
+              <a:graphicData uri="http://schemas.openxmlformats.org/drawingml/2006/picture">
+                <pic:pic xmlns:pic="http://schemas.openxmlformats.org/drawingml/2006/picture">
+                  <pic:nvPicPr>
+                    <pic:cNvPr id="0" name="Picture 8"/>
+                    <pic:cNvPicPr>
+                      <a:picLocks noChangeAspect="1" noChangeArrowheads="1"/>
+                    </pic:cNvPicPr>
+                  </pic:nvPicPr>
+                  <pic:blipFill>
+                    <a:blip r:embed="rId14" cstate="print">
+                      <a:extLst>
+                        <a:ext uri="{28A0092B-C50C-407E-A947-70E740481C1C}">
+                          <a14:useLocalDpi xmlns:a14="http://schemas.microsoft.com/office/drawing/2010/main" val="0"/>
+                        </a:ext>
+                      </a:extLst>
+                    </a:blip>
+                    <a:srcRect/>
+                    <a:stretch>
+                      <a:fillRect/>
+                    </a:stretch>
+                  </pic:blipFill>
+                  <pic:spPr bwMode="auto">
+                    <a:xfrm>
+                      <a:off x="0" y="0"/>
+                      <a:ext cx="1413235" cy="1884262"/>
+                    </a:xfrm>
+                    <a:prstGeom prst="rect">
+                      <a:avLst/>
+                    </a:prstGeom>
+                    <a:noFill/>
+                    <a:ln>
+                      <a:noFill/>
+                    </a:ln>
+                  </pic:spPr>
+                </pic:pic>
+              </a:graphicData>
+            </a:graphic>
+            <wp14:sizeRelH relativeFrom="margin">
+              <wp14:pctWidth>0</wp14:pctWidth>
+            </wp14:sizeRelH>
+            <wp14:sizeRelV relativeFrom="margin">
+              <wp14:pctHeight>0</wp14:pctHeight>
+            </wp14:sizeRelV>
+          </wp:anchor>
+        </w:drawing>
+      </w:r>
+      <w:r>
+        <w:rPr>
+          <w:noProof/>
+          <w:sz w:val="24"/>
+          <w:szCs w:val="24"/>
+        </w:rPr>
+        <w:drawing>
+          <wp:anchor distT="0" distB="0" distL="114300" distR="114300" simplePos="0" relativeHeight="251660288" behindDoc="0" locked="0" layoutInCell="1" allowOverlap="1" wp14:anchorId="0DDFDC5A" wp14:editId="5EC756E6">
+            <wp:simplePos x="0" y="0"/>
+            <wp:positionH relativeFrom="margin">
+              <wp:posOffset>-635</wp:posOffset>
+            </wp:positionH>
+            <wp:positionV relativeFrom="paragraph">
+              <wp:posOffset>277950</wp:posOffset>
+            </wp:positionV>
+            <wp:extent cx="1397000" cy="1863090"/>
+            <wp:effectExtent l="0" t="0" r="0" b="3810"/>
+            <wp:wrapNone/>
+            <wp:docPr id="45171262" name="Picture 8"/>
+            <wp:cNvGraphicFramePr>
+              <a:graphicFrameLocks xmlns:a="http://schemas.openxmlformats.org/drawingml/2006/main" noChangeAspect="1"/>
+            </wp:cNvGraphicFramePr>
+            <a:graphic xmlns:a="http://schemas.openxmlformats.org/drawingml/2006/main">
+              <a:graphicData uri="http://schemas.openxmlformats.org/drawingml/2006/picture">
+                <pic:pic xmlns:pic="http://schemas.openxmlformats.org/drawingml/2006/picture">
+                  <pic:nvPicPr>
+                    <pic:cNvPr id="0" name="Picture 5"/>
+                    <pic:cNvPicPr>
+                      <a:picLocks noChangeAspect="1" noChangeArrowheads="1"/>
+                    </pic:cNvPicPr>
+                  </pic:nvPicPr>
+                  <pic:blipFill>
+                    <a:blip r:embed="rId15" cstate="print">
+                      <a:extLst>
+                        <a:ext uri="{28A0092B-C50C-407E-A947-70E740481C1C}">
+                          <a14:useLocalDpi xmlns:a14="http://schemas.microsoft.com/office/drawing/2010/main" val="0"/>
+                        </a:ext>
+                      </a:extLst>
+                    </a:blip>
+                    <a:srcRect/>
+                    <a:stretch>
+                      <a:fillRect/>
+                    </a:stretch>
+                  </pic:blipFill>
+                  <pic:spPr bwMode="auto">
+                    <a:xfrm>
+                      <a:off x="0" y="0"/>
+                      <a:ext cx="1397000" cy="1863090"/>
+                    </a:xfrm>
+                    <a:prstGeom prst="rect">
+                      <a:avLst/>
+                    </a:prstGeom>
+                    <a:noFill/>
+                    <a:ln>
+                      <a:noFill/>
+                    </a:ln>
+                  </pic:spPr>
+                </pic:pic>
+              </a:graphicData>
+            </a:graphic>
+          </wp:anchor>
+        </w:drawing>
+      </w:r>
+      <w:r>
+        <w:rPr>
+          <w:sz w:val="24"/>
+          <w:szCs w:val="24"/>
+        </w:rPr>
+        <w:t>Costa Cup</w:t>
+      </w:r>
+      <w:r>
+        <w:rPr>
+          <w:sz w:val="24"/>
+          <w:szCs w:val="24"/>
+        </w:rPr>
+        <w:t xml:space="preserve"> Images</w:t>
+      </w:r>
+      <w:r>
+        <w:rPr>
+          <w:sz w:val="24"/>
+          <w:szCs w:val="24"/>
+        </w:rPr>
+        <w:t>:</w:t>
+      </w:r>
+    </w:p>
+    <w:p>
+      <w:pPr>
+        <w:rPr>
+          <w:sz w:val="24"/>
+          <w:szCs w:val="24"/>
+        </w:rPr>
+      </w:pPr>
+    </w:p>
+    <w:p>
+      <w:pPr>
+        <w:rPr>
+          <w:sz w:val="24"/>
+          <w:szCs w:val="24"/>
+        </w:rPr>
+      </w:pPr>
+    </w:p>
+    <w:p>
+      <w:pPr>
+        <w:rPr>
+          <w:sz w:val="24"/>
+          <w:szCs w:val="24"/>
+        </w:rPr>
+      </w:pPr>
+    </w:p>
+    <w:p>
+      <w:pPr>
+        <w:rPr>
+          <w:sz w:val="24"/>
+          <w:szCs w:val="24"/>
+        </w:rPr>
+      </w:pPr>
+    </w:p>
+    <w:p>
+      <w:pPr>
+        <w:rPr>
+          <w:sz w:val="24"/>
+          <w:szCs w:val="24"/>
+        </w:rPr>
+      </w:pPr>
+    </w:p>
+    <w:p>
+      <w:pPr>
+        <w:rPr>
+          <w:sz w:val="24"/>
+          <w:szCs w:val="24"/>
+        </w:rPr>
+      </w:pPr>
+    </w:p>
+    <w:p>
+      <w:pPr>
+        <w:rPr>
+          <w:sz w:val="24"/>
+          <w:szCs w:val="24"/>
+        </w:rPr>
+      </w:pPr>
+    </w:p>
+    <w:p>
+      <w:pPr>
+        <w:rPr>
+          <w:sz w:val="24"/>
+          <w:szCs w:val="24"/>
+        </w:rPr>
+      </w:pPr>
+      <w:r>
+        <w:rPr>
+          <w:sz w:val="24"/>
+          <w:szCs w:val="24"/>
+        </w:rPr>
+        <w:t>Tesco Sandwich Images:</w:t>
+      </w:r>
+    </w:p>
+    <w:p>
+      <w:pPr>
+        <w:rPr>
+          <w:sz w:val="24"/>
+          <w:szCs w:val="24"/>
+        </w:rPr>
+      </w:pPr>
+    </w:p>
+    <w:p>
+      <w:pPr>
+        <w:rPr>
+          <w:sz w:val="24"/>
+          <w:szCs w:val="24"/>
+        </w:rPr>
+      </w:pPr>
+    </w:p>
+    <w:p>
+      <w:pPr>
+        <w:rPr>
+          <w:sz w:val="24"/>
+          <w:szCs w:val="24"/>
+        </w:rPr>
+      </w:pPr>
+    </w:p>
+    <w:p>
+      <w:pPr>
+        <w:rPr>
+          <w:sz w:val="24"/>
+          <w:szCs w:val="24"/>
+        </w:rPr>
+      </w:pPr>
+    </w:p>
+    <w:p>
+      <w:pPr>
+        <w:rPr>
+          <w:sz w:val="24"/>
+          <w:szCs w:val="24"/>
+        </w:rPr>
+      </w:pPr>
+    </w:p>
+    <w:p>
+      <w:pPr>
+        <w:rPr>
+          <w:sz w:val="24"/>
+          <w:szCs w:val="24"/>
+        </w:rPr>
+      </w:pPr>
+    </w:p>
+    <w:p>
+      <w:pPr>
+        <w:rPr>
+          <w:sz w:val="24"/>
+          <w:szCs w:val="24"/>
+        </w:rPr>
+      </w:pPr>
+    </w:p>
+    <w:p>
+      <w:pPr>
+        <w:rPr>
+          <w:sz w:val="24"/>
+          <w:szCs w:val="24"/>
+        </w:rPr>
+      </w:pPr>
+    </w:p>
+    <w:p>
+      <w:pPr>
+        <w:rPr>
+          <w:sz w:val="24"/>
+          <w:szCs w:val="24"/>
+        </w:rPr>
+      </w:pPr>
+      <w:r>
+        <w:rPr>
+          <w:sz w:val="24"/>
+          <w:szCs w:val="24"/>
+        </w:rPr>
+        <w:lastRenderedPageBreak/>
+        <w:t>Jimmys Coffee Images:</w:t>
+      </w:r>
+    </w:p>
+    <w:p>
+      <w:pPr>
+        <w:rPr>
+          <w:sz w:val="24"/>
+          <w:szCs w:val="24"/>
+        </w:rPr>
+      </w:pPr>
+      <w:r>
+        <w:rPr>
+          <w:noProof/>
+          <w:sz w:val="24"/>
+          <w:szCs w:val="24"/>
+        </w:rPr>
+        <w:drawing>
+          <wp:anchor distT="0" distB="0" distL="114300" distR="114300" simplePos="0" relativeHeight="251667456" behindDoc="0" locked="0" layoutInCell="1" allowOverlap="1" wp14:anchorId="2CA3BCA2" wp14:editId="3156AAF9">
+            <wp:simplePos x="0" y="0"/>
+            <wp:positionH relativeFrom="column">
+              <wp:posOffset>4408098</wp:posOffset>
+            </wp:positionH>
+            <wp:positionV relativeFrom="paragraph">
+              <wp:posOffset>85629</wp:posOffset>
+            </wp:positionV>
+            <wp:extent cx="1379855" cy="1840230"/>
+            <wp:effectExtent l="0" t="0" r="0" b="7620"/>
+            <wp:wrapNone/>
+            <wp:docPr id="1558855099" name="Picture 15"/>
+            <wp:cNvGraphicFramePr>
+              <a:graphicFrameLocks xmlns:a="http://schemas.openxmlformats.org/drawingml/2006/main" noChangeAspect="1"/>
+            </wp:cNvGraphicFramePr>
+            <a:graphic xmlns:a="http://schemas.openxmlformats.org/drawingml/2006/main">
+              <a:graphicData uri="http://schemas.openxmlformats.org/drawingml/2006/picture">
+                <pic:pic xmlns:pic="http://schemas.openxmlformats.org/drawingml/2006/picture">
+                  <pic:nvPicPr>
+                    <pic:cNvPr id="0" name="Picture 12"/>
+                    <pic:cNvPicPr>
+                      <a:picLocks noChangeAspect="1" noChangeArrowheads="1"/>
+                    </pic:cNvPicPr>
+                  </pic:nvPicPr>
+                  <pic:blipFill>
+                    <a:blip r:embed="rId16" cstate="print">
+                      <a:extLst>
+                        <a:ext uri="{28A0092B-C50C-407E-A947-70E740481C1C}">
+                          <a14:useLocalDpi xmlns:a14="http://schemas.microsoft.com/office/drawing/2010/main" val="0"/>
+                        </a:ext>
+                      </a:extLst>
+                    </a:blip>
+                    <a:srcRect/>
+                    <a:stretch>
+                      <a:fillRect/>
+                    </a:stretch>
+                  </pic:blipFill>
+                  <pic:spPr bwMode="auto">
+                    <a:xfrm>
+                      <a:off x="0" y="0"/>
+                      <a:ext cx="1379855" cy="1840230"/>
+                    </a:xfrm>
+                    <a:prstGeom prst="rect">
+                      <a:avLst/>
+                    </a:prstGeom>
+                    <a:noFill/>
+                    <a:ln>
+                      <a:noFill/>
+                    </a:ln>
+                  </pic:spPr>
+                </pic:pic>
+              </a:graphicData>
+            </a:graphic>
+          </wp:anchor>
+        </w:drawing>
+      </w:r>
+      <w:r>
+        <w:rPr>
+          <w:noProof/>
+          <w:sz w:val="24"/>
+          <w:szCs w:val="24"/>
+        </w:rPr>
+        <w:drawing>
+          <wp:anchor distT="0" distB="0" distL="114300" distR="114300" simplePos="0" relativeHeight="251666432" behindDoc="0" locked="0" layoutInCell="1" allowOverlap="1" wp14:anchorId="3BCFEC10" wp14:editId="7850082D">
+            <wp:simplePos x="0" y="0"/>
+            <wp:positionH relativeFrom="margin">
+              <wp:posOffset>2958861</wp:posOffset>
+            </wp:positionH>
+            <wp:positionV relativeFrom="paragraph">
+              <wp:posOffset>85366</wp:posOffset>
+            </wp:positionV>
+            <wp:extent cx="1378109" cy="1837427"/>
+            <wp:effectExtent l="0" t="0" r="0" b="0"/>
+            <wp:wrapNone/>
+            <wp:docPr id="734652099" name="Picture 14"/>
+            <wp:cNvGraphicFramePr>
+              <a:graphicFrameLocks xmlns:a="http://schemas.openxmlformats.org/drawingml/2006/main" noChangeAspect="1"/>
+            </wp:cNvGraphicFramePr>
+            <a:graphic xmlns:a="http://schemas.openxmlformats.org/drawingml/2006/main">
+              <a:graphicData uri="http://schemas.openxmlformats.org/drawingml/2006/picture">
+                <pic:pic xmlns:pic="http://schemas.openxmlformats.org/drawingml/2006/picture">
+                  <pic:nvPicPr>
+                    <pic:cNvPr id="0" name="Picture 11"/>
+                    <pic:cNvPicPr>
+                      <a:picLocks noChangeAspect="1" noChangeArrowheads="1"/>
+                    </pic:cNvPicPr>
+                  </pic:nvPicPr>
+                  <pic:blipFill>
+                    <a:blip r:embed="rId17" cstate="print">
+                      <a:extLst>
+                        <a:ext uri="{28A0092B-C50C-407E-A947-70E740481C1C}">
+                          <a14:useLocalDpi xmlns:a14="http://schemas.microsoft.com/office/drawing/2010/main" val="0"/>
+                        </a:ext>
+                      </a:extLst>
+                    </a:blip>
+                    <a:srcRect/>
+                    <a:stretch>
+                      <a:fillRect/>
+                    </a:stretch>
+                  </pic:blipFill>
+                  <pic:spPr bwMode="auto">
+                    <a:xfrm>
+                      <a:off x="0" y="0"/>
+                      <a:ext cx="1378109" cy="1837427"/>
+                    </a:xfrm>
+                    <a:prstGeom prst="rect">
+                      <a:avLst/>
+                    </a:prstGeom>
+                    <a:noFill/>
+                    <a:ln>
+                      <a:noFill/>
+                    </a:ln>
+                  </pic:spPr>
+                </pic:pic>
+              </a:graphicData>
+            </a:graphic>
+            <wp14:sizeRelH relativeFrom="margin">
+              <wp14:pctWidth>0</wp14:pctWidth>
+            </wp14:sizeRelH>
+            <wp14:sizeRelV relativeFrom="margin">
+              <wp14:pctHeight>0</wp14:pctHeight>
+            </wp14:sizeRelV>
+          </wp:anchor>
+        </w:drawing>
+      </w:r>
+      <w:r>
+        <w:rPr>
+          <w:noProof/>
+          <w:sz w:val="24"/>
+          <w:szCs w:val="24"/>
+        </w:rPr>
+        <w:drawing>
+          <wp:anchor distT="0" distB="0" distL="114300" distR="114300" simplePos="0" relativeHeight="251665408" behindDoc="0" locked="0" layoutInCell="1" allowOverlap="1" wp14:anchorId="05E77168" wp14:editId="43499117">
+            <wp:simplePos x="0" y="0"/>
+            <wp:positionH relativeFrom="margin">
+              <wp:posOffset>1491879</wp:posOffset>
+            </wp:positionH>
+            <wp:positionV relativeFrom="paragraph">
+              <wp:posOffset>86995</wp:posOffset>
+            </wp:positionV>
+            <wp:extent cx="1370965" cy="1828165"/>
+            <wp:effectExtent l="0" t="0" r="635" b="635"/>
+            <wp:wrapNone/>
+            <wp:docPr id="1937486985" name="Picture 13"/>
+            <wp:cNvGraphicFramePr>
+              <a:graphicFrameLocks xmlns:a="http://schemas.openxmlformats.org/drawingml/2006/main" noChangeAspect="1"/>
+            </wp:cNvGraphicFramePr>
+            <a:graphic xmlns:a="http://schemas.openxmlformats.org/drawingml/2006/main">
+              <a:graphicData uri="http://schemas.openxmlformats.org/drawingml/2006/picture">
+                <pic:pic xmlns:pic="http://schemas.openxmlformats.org/drawingml/2006/picture">
+                  <pic:nvPicPr>
+                    <pic:cNvPr id="0" name="Picture 10"/>
+                    <pic:cNvPicPr>
+                      <a:picLocks noChangeAspect="1" noChangeArrowheads="1"/>
+                    </pic:cNvPicPr>
+                  </pic:nvPicPr>
+                  <pic:blipFill>
+                    <a:blip r:embed="rId18" cstate="print">
+                      <a:extLst>
+                        <a:ext uri="{28A0092B-C50C-407E-A947-70E740481C1C}">
+                          <a14:useLocalDpi xmlns:a14="http://schemas.microsoft.com/office/drawing/2010/main" val="0"/>
+                        </a:ext>
+                      </a:extLst>
+                    </a:blip>
+                    <a:srcRect/>
+                    <a:stretch>
+                      <a:fillRect/>
+                    </a:stretch>
+                  </pic:blipFill>
+                  <pic:spPr bwMode="auto">
+                    <a:xfrm>
+                      <a:off x="0" y="0"/>
+                      <a:ext cx="1370965" cy="1828165"/>
+                    </a:xfrm>
+                    <a:prstGeom prst="rect">
+                      <a:avLst/>
+                    </a:prstGeom>
+                    <a:noFill/>
+                    <a:ln>
+                      <a:noFill/>
+                    </a:ln>
+                  </pic:spPr>
+                </pic:pic>
+              </a:graphicData>
+            </a:graphic>
+            <wp14:sizeRelH relativeFrom="margin">
+              <wp14:pctWidth>0</wp14:pctWidth>
+            </wp14:sizeRelH>
+            <wp14:sizeRelV relativeFrom="margin">
+              <wp14:pctHeight>0</wp14:pctHeight>
+            </wp14:sizeRelV>
+          </wp:anchor>
+        </w:drawing>
+      </w:r>
+      <w:r>
+        <w:rPr>
+          <w:noProof/>
+          <w:sz w:val="24"/>
+          <w:szCs w:val="24"/>
+        </w:rPr>
+        <w:drawing>
+          <wp:anchor distT="0" distB="0" distL="114300" distR="114300" simplePos="0" relativeHeight="251664384" behindDoc="0" locked="0" layoutInCell="1" allowOverlap="1" wp14:anchorId="3B7C910B" wp14:editId="2D2D70B5">
+            <wp:simplePos x="0" y="0"/>
+            <wp:positionH relativeFrom="margin">
+              <wp:posOffset>34206</wp:posOffset>
+            </wp:positionH>
+            <wp:positionV relativeFrom="paragraph">
+              <wp:posOffset>89955</wp:posOffset>
+            </wp:positionV>
+            <wp:extent cx="1336675" cy="1782445"/>
+            <wp:effectExtent l="0" t="0" r="0" b="8255"/>
+            <wp:wrapNone/>
+            <wp:docPr id="159667901" name="Picture 12"/>
+            <wp:cNvGraphicFramePr>
+              <a:graphicFrameLocks xmlns:a="http://schemas.openxmlformats.org/drawingml/2006/main" noChangeAspect="1"/>
+            </wp:cNvGraphicFramePr>
+            <a:graphic xmlns:a="http://schemas.openxmlformats.org/drawingml/2006/main">
+              <a:graphicData uri="http://schemas.openxmlformats.org/drawingml/2006/picture">
+                <pic:pic xmlns:pic="http://schemas.openxmlformats.org/drawingml/2006/picture">
+                  <pic:nvPicPr>
+                    <pic:cNvPr id="0" name="Picture 9"/>
+                    <pic:cNvPicPr>
+                      <a:picLocks noChangeAspect="1" noChangeArrowheads="1"/>
+                    </pic:cNvPicPr>
+                  </pic:nvPicPr>
+                  <pic:blipFill>
+                    <a:blip r:embed="rId19" cstate="print">
+                      <a:extLst>
+                        <a:ext uri="{28A0092B-C50C-407E-A947-70E740481C1C}">
+                          <a14:useLocalDpi xmlns:a14="http://schemas.microsoft.com/office/drawing/2010/main" val="0"/>
+                        </a:ext>
+                      </a:extLst>
+                    </a:blip>
+                    <a:srcRect/>
+                    <a:stretch>
+                      <a:fillRect/>
+                    </a:stretch>
+                  </pic:blipFill>
+                  <pic:spPr bwMode="auto">
+                    <a:xfrm>
+                      <a:off x="0" y="0"/>
+                      <a:ext cx="1336675" cy="1782445"/>
+                    </a:xfrm>
+                    <a:prstGeom prst="rect">
+                      <a:avLst/>
+                    </a:prstGeom>
+                    <a:noFill/>
+                    <a:ln>
+                      <a:noFill/>
+                    </a:ln>
+                  </pic:spPr>
+                </pic:pic>
+              </a:graphicData>
+            </a:graphic>
+            <wp14:sizeRelH relativeFrom="margin">
+              <wp14:pctWidth>0</wp14:pctWidth>
+            </wp14:sizeRelH>
+            <wp14:sizeRelV relativeFrom="margin">
+              <wp14:pctHeight>0</wp14:pctHeight>
+            </wp14:sizeRelV>
+          </wp:anchor>
+        </w:drawing>
+      </w:r>
+    </w:p>
+    <w:p>
+      <w:pPr>
+        <w:rPr>
+          <w:sz w:val="24"/>
+          <w:szCs w:val="24"/>
+        </w:rPr>
+      </w:pPr>
+    </w:p>
+    <w:p>
+      <w:pPr>
+        <w:rPr>
+          <w:sz w:val="24"/>
+          <w:szCs w:val="24"/>
+        </w:rPr>
+      </w:pPr>
+    </w:p>
+    <w:p>
+      <w:pPr>
+        <w:rPr>
+          <w:sz w:val="24"/>
+          <w:szCs w:val="24"/>
+        </w:rPr>
+      </w:pPr>
+    </w:p>
+    <w:p>
+      <w:pPr>
+        <w:rPr>
+          <w:sz w:val="24"/>
+          <w:szCs w:val="24"/>
+        </w:rPr>
+      </w:pPr>
+    </w:p>
+    <w:p>
+      <w:pPr>
+        <w:rPr>
+          <w:sz w:val="24"/>
+          <w:szCs w:val="24"/>
+        </w:rPr>
+      </w:pPr>
+    </w:p>
+    <w:p>
+      <w:pPr>
+        <w:rPr>
+          <w:sz w:val="24"/>
+          <w:szCs w:val="24"/>
+        </w:rPr>
+      </w:pPr>
+    </w:p>
+    <w:p>
+      <w:pPr>
+        <w:rPr>
+          <w:b/>
+          <w:bCs/>
+          <w:sz w:val="28"/>
+          <w:szCs w:val="28"/>
+          <w:u w:val="single"/>
+        </w:rPr>
+      </w:pPr>
+      <w:r>
+        <w:rPr>
+          <w:noProof/>
+        </w:rPr>
+        <mc:AlternateContent>
+          <mc:Choice Requires="wps">
+            <w:drawing>
+              <wp:anchor distT="0" distB="0" distL="114300" distR="114300" simplePos="0" relativeHeight="251657215" behindDoc="0" locked="0" layoutInCell="1" allowOverlap="1" wp14:anchorId="53379137" wp14:editId="482C44E0">
+                <wp:simplePos x="0" y="0"/>
+                <wp:positionH relativeFrom="column">
+                  <wp:posOffset>8626</wp:posOffset>
+                </wp:positionH>
+                <wp:positionV relativeFrom="paragraph">
+                  <wp:posOffset>324115</wp:posOffset>
+                </wp:positionV>
+                <wp:extent cx="5891530" cy="4157824"/>
+                <wp:effectExtent l="0" t="0" r="13970" b="14605"/>
+                <wp:wrapNone/>
+                <wp:docPr id="1790872478" name="Rectangle 7"/>
+                <wp:cNvGraphicFramePr/>
+                <a:graphic xmlns:a="http://schemas.openxmlformats.org/drawingml/2006/main">
+                  <a:graphicData uri="http://schemas.microsoft.com/office/word/2010/wordprocessingShape">
+                    <wps:wsp>
+                      <wps:cNvSpPr/>
+                      <wps:spPr>
+                        <a:xfrm>
+                          <a:off x="0" y="0"/>
+                          <a:ext cx="5891530" cy="4157824"/>
+                        </a:xfrm>
+                        <a:prstGeom prst="rect">
+                          <a:avLst/>
+                        </a:prstGeom>
+                      </wps:spPr>
+                      <wps:style>
+                        <a:lnRef idx="2">
+                          <a:schemeClr val="accent3">
+                            <a:shade val="15000"/>
+                          </a:schemeClr>
+                        </a:lnRef>
+                        <a:fillRef idx="1">
+                          <a:schemeClr val="accent3"/>
+                        </a:fillRef>
+                        <a:effectRef idx="0">
+                          <a:schemeClr val="accent3"/>
+                        </a:effectRef>
+                        <a:fontRef idx="minor">
+                          <a:schemeClr val="lt1"/>
+                        </a:fontRef>
+                      </wps:style>
+                      <wps:bodyPr rot="0" spcFirstLastPara="0" vertOverflow="overflow" horzOverflow="overflow" vert="horz" wrap="square" lIns="91440" tIns="45720" rIns="91440" bIns="45720" numCol="1" spcCol="0" rtlCol="0" fromWordArt="0" anchor="ctr" anchorCtr="0" forceAA="0" compatLnSpc="1">
+                        <a:prstTxWarp prst="textNoShape">
+                          <a:avLst/>
+                        </a:prstTxWarp>
+                        <a:noAutofit/>
+                      </wps:bodyPr>
+                    </wps:wsp>
+                  </a:graphicData>
+                </a:graphic>
+                <wp14:sizeRelV relativeFrom="margin">
+                  <wp14:pctHeight>0</wp14:pctHeight>
+                </wp14:sizeRelV>
+              </wp:anchor>
+            </w:drawing>
+          </mc:Choice>
+          <mc:Fallback>
+            <w:pict>
+              <v:rect w14:anchorId="2226C62E" id="Rectangle 7" o:spid="_x0000_s1026" style="position:absolute;margin-left:.7pt;margin-top:25.5pt;width:463.9pt;height:327.4pt;z-index:251657215;visibility:visible;mso-wrap-style:square;mso-height-percent:0;mso-wrap-distance-left:9pt;mso-wrap-distance-top:0;mso-wrap-distance-right:9pt;mso-wrap-distance-bottom:0;mso-position-horizontal:absolute;mso-position-horizontal-relative:text;mso-position-vertical:absolute;mso-position-vertical-relative:text;mso-height-percent:0;mso-height-relative:margin;v-text-anchor:middle" o:gfxdata="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" fillcolor="#a5a5a5 [3206]" strokecolor="#181818 [486]" strokeweight="1pt"/>
+            </w:pict>
+          </mc:Fallback>
+        </mc:AlternateContent>
+      </w:r>
+      <w:r>
+        <w:rPr>
+          <w:b/>
+          <w:bCs/>
+          <w:sz w:val="28"/>
+          <w:szCs w:val="28"/>
+          <w:u w:val="single"/>
+        </w:rPr>
+        <w:t>Testing Documents</w:t>
+      </w:r>
+    </w:p>
+    <w:p>
+      <w:pPr>
+        <w:rPr>
+          <w:sz w:val="24"/>
+          <w:szCs w:val="24"/>
+        </w:rPr>
+      </w:pPr>
+      <w:r>
+        <w:drawing>
+          <wp:anchor distT="0" distB="0" distL="114300" distR="114300" simplePos="0" relativeHeight="251658240" behindDoc="0" locked="0" layoutInCell="1" allowOverlap="1" wp14:anchorId="436D12B0" wp14:editId="35574D04">
+            <wp:simplePos x="0" y="0"/>
+            <wp:positionH relativeFrom="column">
+              <wp:posOffset>2846717</wp:posOffset>
+            </wp:positionH>
+            <wp:positionV relativeFrom="paragraph">
+              <wp:posOffset>6086</wp:posOffset>
+            </wp:positionV>
+            <wp:extent cx="3053751" cy="4167480"/>
+            <wp:effectExtent l="0" t="0" r="0" b="5080"/>
+            <wp:wrapNone/>
+            <wp:docPr id="1362951520" name="Picture 6"/>
+            <wp:cNvGraphicFramePr>
+              <a:graphicFrameLocks xmlns:a="http://schemas.openxmlformats.org/drawingml/2006/main" noChangeAspect="1"/>
+            </wp:cNvGraphicFramePr>
+            <a:graphic xmlns:a="http://schemas.openxmlformats.org/drawingml/2006/main">
+              <a:graphicData uri="http://schemas.openxmlformats.org/drawingml/2006/picture">
+                <pic:pic xmlns:pic="http://schemas.openxmlformats.org/drawingml/2006/picture">
+                  <pic:nvPicPr>
+                    <pic:cNvPr id="0" name="Picture 4"/>
+                    <pic:cNvPicPr>
+                      <a:picLocks noChangeAspect="1" noChangeArrowheads="1"/>
+                    </pic:cNvPicPr>
+                  </pic:nvPicPr>
+                  <pic:blipFill>
+                    <a:blip r:embed="rId20">
+                      <a:extLst>
+                        <a:ext uri="{28A0092B-C50C-407E-A947-70E740481C1C}">
+                          <a14:useLocalDpi xmlns:a14="http://schemas.microsoft.com/office/drawing/2010/main" val="0"/>
+                        </a:ext>
+                      </a:extLst>
+                    </a:blip>
+                    <a:srcRect/>
+                    <a:stretch>
+                      <a:fillRect/>
+                    </a:stretch>
+                  </pic:blipFill>
+                  <pic:spPr bwMode="auto">
+                    <a:xfrm>
+                      <a:off x="0" y="0"/>
+                      <a:ext cx="3059421" cy="4175218"/>
+                    </a:xfrm>
+                    <a:prstGeom prst="rect">
+                      <a:avLst/>
+                    </a:prstGeom>
+                    <a:noFill/>
+                    <a:ln>
+                      <a:noFill/>
+                    </a:ln>
+                  </pic:spPr>
+                </pic:pic>
+              </a:graphicData>
+            </a:graphic>
+            <wp14:sizeRelH relativeFrom="margin">
+              <wp14:pctWidth>0</wp14:pctWidth>
+            </wp14:sizeRelH>
+            <wp14:sizeRelV relativeFrom="margin">
+              <wp14:pctHeight>0</wp14:pctHeight>
+            </wp14:sizeRelV>
+          </wp:anchor>
+        </w:drawing>
+      </w:r>
+      <w:r>
+        <w:drawing>
+          <wp:anchor distT="0" distB="0" distL="114300" distR="114300" simplePos="0" relativeHeight="251659264" behindDoc="0" locked="0" layoutInCell="1" allowOverlap="1" wp14:anchorId="00B38950" wp14:editId="13F85E4D">
+            <wp:simplePos x="0" y="0"/>
+            <wp:positionH relativeFrom="column">
+              <wp:posOffset>0</wp:posOffset>
+            </wp:positionH>
+            <wp:positionV relativeFrom="paragraph">
+              <wp:posOffset>-2540</wp:posOffset>
+            </wp:positionV>
+            <wp:extent cx="2708275" cy="4183380"/>
+            <wp:effectExtent l="0" t="0" r="0" b="7620"/>
+            <wp:wrapNone/>
+            <wp:docPr id="1713752971" name="Picture 5"/>
+            <wp:cNvGraphicFramePr>
+              <a:graphicFrameLocks xmlns:a="http://schemas.openxmlformats.org/drawingml/2006/main" noChangeAspect="1"/>
+            </wp:cNvGraphicFramePr>
+            <a:graphic xmlns:a="http://schemas.openxmlformats.org/drawingml/2006/main">
+              <a:graphicData uri="http://schemas.openxmlformats.org/drawingml/2006/picture">
+                <pic:pic xmlns:pic="http://schemas.openxmlformats.org/drawingml/2006/picture">
+                  <pic:nvPicPr>
+                    <pic:cNvPr id="0" name="Picture 3"/>
+                    <pic:cNvPicPr>
+                      <a:picLocks noChangeAspect="1" noChangeArrowheads="1"/>
+                    </pic:cNvPicPr>
+                  </pic:nvPicPr>
+                  <pic:blipFill>
+                    <a:blip r:embed="rId21">
+                      <a:extLst>
+                        <a:ext uri="{28A0092B-C50C-407E-A947-70E740481C1C}">
+                          <a14:useLocalDpi xmlns:a14="http://schemas.microsoft.com/office/drawing/2010/main" val="0"/>
+                        </a:ext>
+                      </a:extLst>
+                    </a:blip>
+                    <a:srcRect/>
+                    <a:stretch>
+                      <a:fillRect/>
+                    </a:stretch>
+                  </pic:blipFill>
+                  <pic:spPr bwMode="auto">
+                    <a:xfrm>
+                      <a:off x="0" y="0"/>
+                      <a:ext cx="2708275" cy="4183380"/>
+                    </a:xfrm>
+                    <a:prstGeom prst="rect">
+                      <a:avLst/>
+                    </a:prstGeom>
+                    <a:noFill/>
+                    <a:ln>
+                      <a:noFill/>
+                    </a:ln>
+                  </pic:spPr>
+                </pic:pic>
+              </a:graphicData>
+            </a:graphic>
+          </wp:anchor>
+        </w:drawing>
+      </w:r>
     </w:p>
     <w:sectPr>
       <w:pgSz w:w="11906" w:h="16838"/>
@@ -790,6 +2342,126 @@
     </w:sectPr>
   </w:body>
 </w:document>
+</file>
+
+<file path=word/numbering.xml><?xml version="1.0" encoding="utf-8"?>
+<w:numbering xmlns:wpc="http://schemas.microsoft.com/office/word/2010/wordprocessingCanvas" xmlns:cx="http://schemas.microsoft.com/office/drawing/2014/chartex" xmlns:cx1="http://schemas.microsoft.com/office/drawing/2015/9/8/chartex" xmlns:cx2="http://schemas.microsoft.com/office/drawing/2015/10/21/chartex" xmlns:cx3="http://schemas.microsoft.com/office/drawing/2016/5/9/chartex" xmlns:cx4="http://schemas.microsoft.com/office/drawing/2016/5/10/chartex" xmlns:cx5="http://schemas.microsoft.com/office/drawing/2016/5/11/chartex" xmlns:cx6="http://schemas.microsoft.com/office/drawing/2016/5/12/chartex" xmlns:cx7="http://schemas.microsoft.com/office/drawing/2016/5/13/chartex" xmlns:cx8="http://schemas.microsoft.com/office/drawing/2016/5/14/chartex" xmlns:mc="http://schemas.openxmlformats.org/markup-compatibility/2006" xmlns:aink="http://schemas.microsoft.com/office/drawing/2016/ink" xmlns:am3d="http://schemas.microsoft.com/office/drawing/2017/model3d" xmlns:o="urn:schemas-microsoft-com:office:office" xmlns:oel="http://schemas.microsoft.com/office/2019/extlst" xmlns:r="http://schemas.openxmlformats.org/officeDocument/2006/relationships" xmlns:m="http://schemas.openxmlformats.org/officeDocument/2006/math" xmlns:v="urn:schemas-microsoft-com:vml" xmlns:wp14="http://schemas.microsoft.com/office/word/2010/wordprocessingDrawing" xmlns:wp="http://schemas.openxmlformats.org/drawingml/2006/wordprocessingDrawing" xmlns:w10="urn:schemas-microsoft-com:office:word" xmlns:w="http://schemas.openxmlformats.org/wordprocessingml/2006/main" xmlns:w14="http://schemas.microsoft.com/office/word/2010/wordml" xmlns:w15="http://schemas.microsoft.com/office/word/2012/wordml" xmlns:w16cex="http://schemas.microsoft.com/office/word/2018/wordml/cex" xmlns:w16cid="http://schemas.microsoft.com/office/word/2016/wordml/cid" xmlns:w16="http://schemas.microsoft.com/office/word/2018/wordml" xmlns:w16du="http://schemas.microsoft.com/office/word/2023/wordml/word16du" xmlns:w16sdtdh="http://schemas.microsoft.com/office/word/2020/wordml/sdtdatahash" xmlns:w16sdtfl="http://schemas.microsoft.com/office/word/2024/wordml/sdtformatlock" xmlns:w16se="http://schemas.microsoft.com/office/word/2015/wordml/symex" xmlns:wpg="http://schemas.microsoft.com/office/word/2010/wordprocessingGroup" xmlns:wpi="http://schemas.microsoft.com/office/word/2010/wordprocessingInk" xmlns:wne="http://schemas.microsoft.com/office/word/2006/wordml" xmlns:wps="http://schemas.microsoft.com/office/word/2010/wordprocessingShape" mc:Ignorable="w14 w15 w16se w16cid w16 w16cex w16sdtdh w16sdtfl w16du wp14">
+  <w:abstractNum w:abstractNumId="0" w15:restartNumberingAfterBreak="0">
+    <w:nsid w:val="334217CE"/>
+    <w:multiLevelType w:val="hybridMultilevel"/>
+    <w:tmpl w:val="9C6A101C"/>
+    <w:lvl w:ilvl="0" w:tplc="8F0ADDB6">
+      <w:numFmt w:val="bullet"/>
+      <w:lvlText w:val="-"/>
+      <w:lvlJc w:val="left"/>
+      <w:pPr>
+        <w:ind w:left="720" w:hanging="360"/>
+      </w:pPr>
+      <w:rPr>
+        <w:rFonts w:ascii="Calibri" w:eastAsiaTheme="minorHAnsi" w:hAnsi="Calibri" w:cs="Calibri" w:hint="default"/>
+      </w:rPr>
+    </w:lvl>
+    <w:lvl w:ilvl="1" w:tplc="08090003" w:tentative="1">
+      <w:start w:val="1"/>
+      <w:numFmt w:val="bullet"/>
+      <w:lvlText w:val="o"/>
+      <w:lvlJc w:val="left"/>
+      <w:pPr>
+        <w:ind w:left="1440" w:hanging="360"/>
+      </w:pPr>
+      <w:rPr>
+        <w:rFonts w:ascii="Courier New" w:hAnsi="Courier New" w:cs="Courier New" w:hint="default"/>
+      </w:rPr>
+    </w:lvl>
+    <w:lvl w:ilvl="2" w:tplc="08090005" w:tentative="1">
+      <w:start w:val="1"/>
+      <w:numFmt w:val="bullet"/>
+      <w:lvlText w:val=""/>
+      <w:lvlJc w:val="left"/>
+      <w:pPr>
+        <w:ind w:left="2160" w:hanging="360"/>
+      </w:pPr>
+      <w:rPr>
+        <w:rFonts w:ascii="Wingdings" w:hAnsi="Wingdings" w:hint="default"/>
+      </w:rPr>
+    </w:lvl>
+    <w:lvl w:ilvl="3" w:tplc="08090001" w:tentative="1">
+      <w:start w:val="1"/>
+      <w:numFmt w:val="bullet"/>
+      <w:lvlText w:val=""/>
+      <w:lvlJc w:val="left"/>
+      <w:pPr>
+        <w:ind w:left="2880" w:hanging="360"/>
+      </w:pPr>
+      <w:rPr>
+        <w:rFonts w:ascii="Symbol" w:hAnsi="Symbol" w:hint="default"/>
+      </w:rPr>
+    </w:lvl>
+    <w:lvl w:ilvl="4" w:tplc="08090003" w:tentative="1">
+      <w:start w:val="1"/>
+      <w:numFmt w:val="bullet"/>
+      <w:lvlText w:val="o"/>
+      <w:lvlJc w:val="left"/>
+      <w:pPr>
+        <w:ind w:left="3600" w:hanging="360"/>
+      </w:pPr>
+      <w:rPr>
+        <w:rFonts w:ascii="Courier New" w:hAnsi="Courier New" w:cs="Courier New" w:hint="default"/>
+      </w:rPr>
+    </w:lvl>
+    <w:lvl w:ilvl="5" w:tplc="08090005" w:tentative="1">
+      <w:start w:val="1"/>
+      <w:numFmt w:val="bullet"/>
+      <w:lvlText w:val=""/>
+      <w:lvlJc w:val="left"/>
+      <w:pPr>
+        <w:ind w:left="4320" w:hanging="360"/>
+      </w:pPr>
+      <w:rPr>
+        <w:rFonts w:ascii="Wingdings" w:hAnsi="Wingdings" w:hint="default"/>
+      </w:rPr>
+    </w:lvl>
+    <w:lvl w:ilvl="6" w:tplc="08090001" w:tentative="1">
+      <w:start w:val="1"/>
+      <w:numFmt w:val="bullet"/>
+      <w:lvlText w:val=""/>
+      <w:lvlJc w:val="left"/>
+      <w:pPr>
+        <w:ind w:left="5040" w:hanging="360"/>
+      </w:pPr>
+      <w:rPr>
+        <w:rFonts w:ascii="Symbol" w:hAnsi="Symbol" w:hint="default"/>
+      </w:rPr>
+    </w:lvl>
+    <w:lvl w:ilvl="7" w:tplc="08090003" w:tentative="1">
+      <w:start w:val="1"/>
+      <w:numFmt w:val="bullet"/>
+      <w:lvlText w:val="o"/>
+      <w:lvlJc w:val="left"/>
+      <w:pPr>
+        <w:ind w:left="5760" w:hanging="360"/>
+      </w:pPr>
+      <w:rPr>
+        <w:rFonts w:ascii="Courier New" w:hAnsi="Courier New" w:cs="Courier New" w:hint="default"/>
+      </w:rPr>
+    </w:lvl>
+    <w:lvl w:ilvl="8" w:tplc="08090005" w:tentative="1">
+      <w:start w:val="1"/>
+      <w:numFmt w:val="bullet"/>
+      <w:lvlText w:val=""/>
+      <w:lvlJc w:val="left"/>
+      <w:pPr>
+        <w:ind w:left="6480" w:hanging="360"/>
+      </w:pPr>
+      <w:rPr>
+        <w:rFonts w:ascii="Wingdings" w:hAnsi="Wingdings" w:hint="default"/>
+      </w:rPr>
+    </w:lvl>
+  </w:abstractNum>
+  <w:num w:numId="1" w16cid:durableId="2025856940">
+    <w:abstractNumId w:val="0"/>
+  </w:num>
+</w:numbering>
 </file>
 
 <file path=word/styles.xml><?xml version="1.0" encoding="utf-8"?>
@@ -1729,6 +3401,25 @@
       <w:shd w:val="clear" w:color="auto" w:fill="E1DFDD"/>
     </w:rPr>
   </w:style>
+  <w:style w:type="table" w:styleId="TableGrid">
+    <w:name w:val="Table Grid"/>
+    <w:basedOn w:val="TableNormal"/>
+    <w:uiPriority w:val="39"/>
+    <w:rsid w:val="001B10D2"/>
+    <w:pPr>
+      <w:spacing w:after="0" w:line="240" w:lineRule="auto"/>
+    </w:pPr>
+    <w:tblPr>
+      <w:tblBorders>
+        <w:top w:val="single" w:sz="4" w:space="0" w:color="auto"/>
+        <w:left w:val="single" w:sz="4" w:space="0" w:color="auto"/>
+        <w:bottom w:val="single" w:sz="4" w:space="0" w:color="auto"/>
+        <w:right w:val="single" w:sz="4" w:space="0" w:color="auto"/>
+        <w:insideH w:val="single" w:sz="4" w:space="0" w:color="auto"/>
+        <w:insideV w:val="single" w:sz="4" w:space="0" w:color="auto"/>
+      </w:tblBorders>
+    </w:tblPr>
+  </w:style>
 </w:styles>
 </file>
 

</xml_diff>